<commit_message>
docs: demo recording link updated
</commit_message>
<xml_diff>
--- a/Documentation/MLOps_Heart_Disease_Assignment_Report.docx
+++ b/Documentation/MLOps_Heart_Disease_Assignment_Report.docx
@@ -109,12 +109,6 @@
         <w:gridCol w:w="6560"/>
       </w:tblGrid>
       <w:tr>
-        <w:tblPrEx>
-          <w:tblCellMar>
-            <w:top w:w="0" w:type="dxa"/>
-            <w:bottom w:w="0" w:type="dxa"/>
-          </w:tblCellMar>
-        </w:tblPrEx>
         <w:tc>
           <w:tcPr>
             <w:tcW w:w="2800" w:type="dxa"/>
@@ -167,21 +161,12 @@
               <w:t xml:space="preserve"> (</w:t>
             </w:r>
             <w:r>
-              <w:t>2025cs05045</w:t>
-            </w:r>
-            <w:r>
-              <w:t>)</w:t>
+              <w:t>2025cs05045)</w:t>
             </w:r>
           </w:p>
         </w:tc>
       </w:tr>
       <w:tr>
-        <w:tblPrEx>
-          <w:tblCellMar>
-            <w:top w:w="0" w:type="dxa"/>
-            <w:bottom w:w="0" w:type="dxa"/>
-          </w:tblCellMar>
-        </w:tblPrEx>
         <w:tc>
           <w:tcPr>
             <w:tcW w:w="2800" w:type="dxa"/>
@@ -234,12 +219,6 @@
         </w:tc>
       </w:tr>
       <w:tr>
-        <w:tblPrEx>
-          <w:tblCellMar>
-            <w:top w:w="0" w:type="dxa"/>
-            <w:bottom w:w="0" w:type="dxa"/>
-          </w:tblCellMar>
-        </w:tblPrEx>
         <w:tc>
           <w:tcPr>
             <w:tcW w:w="2800" w:type="dxa"/>
@@ -258,13 +237,20 @@
             </w:tcMar>
           </w:tcPr>
           <w:p>
-            <w:r>
+            <w:pPr>
               <w:rPr>
                 <w:b/>
                 <w:bCs/>
                 <w:color w:val="17365D"/>
               </w:rPr>
-              <w:t>Deployed API</w:t>
+            </w:pPr>
+            <w:r>
+              <w:rPr>
+                <w:b/>
+                <w:bCs/>
+                <w:color w:val="17365D"/>
+              </w:rPr>
+              <w:t xml:space="preserve">Demo Recording </w:t>
             </w:r>
           </w:p>
         </w:tc>
@@ -286,18 +272,12 @@
           </w:tcPr>
           <w:p>
             <w:r>
-              <w:t>http://34.31.48.169:8000  |  /docs for Swagger UI</w:t>
+              <w:t>https://github.com/jyotichughgit/heart-disease-mlops/tree/main/recording</w:t>
             </w:r>
           </w:p>
         </w:tc>
       </w:tr>
       <w:tr>
-        <w:tblPrEx>
-          <w:tblCellMar>
-            <w:top w:w="0" w:type="dxa"/>
-            <w:bottom w:w="0" w:type="dxa"/>
-          </w:tblCellMar>
-        </w:tblPrEx>
         <w:tc>
           <w:tcPr>
             <w:tcW w:w="2800" w:type="dxa"/>
@@ -322,7 +302,7 @@
                 <w:bCs/>
                 <w:color w:val="17365D"/>
               </w:rPr>
-              <w:t>Best Model</w:t>
+              <w:t>Deployed API</w:t>
             </w:r>
           </w:p>
         </w:tc>
@@ -344,18 +324,12 @@
           </w:tcPr>
           <w:p>
             <w:r>
-              <w:t>Logistic Regression — Test ROC-AUC: 0.9665</w:t>
+              <w:t>http://34.31.48.169:8000  |  /docs for Swagger UI</w:t>
             </w:r>
           </w:p>
         </w:tc>
       </w:tr>
       <w:tr>
-        <w:tblPrEx>
-          <w:tblCellMar>
-            <w:top w:w="0" w:type="dxa"/>
-            <w:bottom w:w="0" w:type="dxa"/>
-          </w:tblCellMar>
-        </w:tblPrEx>
         <w:tc>
           <w:tcPr>
             <w:tcW w:w="2800" w:type="dxa"/>
@@ -380,7 +354,7 @@
                 <w:bCs/>
                 <w:color w:val="17365D"/>
               </w:rPr>
-              <w:t>Test Suite</w:t>
+              <w:t>Best Model</w:t>
             </w:r>
           </w:p>
         </w:tc>
@@ -402,6 +376,58 @@
           </w:tcPr>
           <w:p>
             <w:r>
+              <w:t>Logistic Regression — Test ROC-AUC: 0.9665</w:t>
+            </w:r>
+          </w:p>
+        </w:tc>
+      </w:tr>
+      <w:tr>
+        <w:tc>
+          <w:tcPr>
+            <w:tcW w:w="2800" w:type="dxa"/>
+            <w:tcBorders>
+              <w:top w:val="single" w:sz="1" w:space="0" w:color="B8CCE4"/>
+              <w:left w:val="single" w:sz="1" w:space="0" w:color="B8CCE4"/>
+              <w:bottom w:val="single" w:sz="1" w:space="0" w:color="B8CCE4"/>
+              <w:right w:val="single" w:sz="1" w:space="0" w:color="B8CCE4"/>
+            </w:tcBorders>
+            <w:shd w:val="clear" w:color="auto" w:fill="DBE5F1"/>
+            <w:tcMar>
+              <w:top w:w="80" w:type="dxa"/>
+              <w:left w:w="130" w:type="dxa"/>
+              <w:bottom w:w="80" w:type="dxa"/>
+              <w:right w:w="130" w:type="dxa"/>
+            </w:tcMar>
+          </w:tcPr>
+          <w:p>
+            <w:r>
+              <w:rPr>
+                <w:b/>
+                <w:bCs/>
+                <w:color w:val="17365D"/>
+              </w:rPr>
+              <w:t>Test Suite</w:t>
+            </w:r>
+          </w:p>
+        </w:tc>
+        <w:tc>
+          <w:tcPr>
+            <w:tcW w:w="6560" w:type="dxa"/>
+            <w:tcBorders>
+              <w:top w:val="single" w:sz="1" w:space="0" w:color="B8CCE4"/>
+              <w:left w:val="single" w:sz="1" w:space="0" w:color="B8CCE4"/>
+              <w:bottom w:val="single" w:sz="1" w:space="0" w:color="B8CCE4"/>
+              <w:right w:val="single" w:sz="1" w:space="0" w:color="B8CCE4"/>
+            </w:tcBorders>
+            <w:tcMar>
+              <w:top w:w="80" w:type="dxa"/>
+              <w:left w:w="130" w:type="dxa"/>
+              <w:bottom w:w="80" w:type="dxa"/>
+              <w:right w:w="130" w:type="dxa"/>
+            </w:tcMar>
+          </w:tcPr>
+          <w:p>
+            <w:r>
               <w:t>38 unit tests | 10 test classes | 80.16% coverage</w:t>
             </w:r>
           </w:p>
@@ -540,13 +566,7 @@
         <w:spacing w:before="60" w:after="80"/>
       </w:pPr>
       <w:r>
-        <w:t xml:space="preserve">This </w:t>
-      </w:r>
-      <w:r>
-        <w:t xml:space="preserve">project </w:t>
-      </w:r>
-      <w:r>
-        <w:t xml:space="preserve">report presents a production-grade </w:t>
+        <w:t xml:space="preserve">This project report presents a production-grade </w:t>
       </w:r>
       <w:proofErr w:type="spellStart"/>
       <w:r>
@@ -554,13 +574,7 @@
       </w:r>
       <w:proofErr w:type="spellEnd"/>
       <w:r>
-        <w:t xml:space="preserve"> pipeline built to predict heart disease risk from patient clinical data, covering every stage from raw data ingestion through to live Kubernetes deployment and real-time monitoring.</w:t>
-      </w:r>
-      <w:r>
-        <w:t xml:space="preserve"> </w:t>
-      </w:r>
-      <w:r>
-        <w:t xml:space="preserve">This project builds, deploys and monitors a binary heart disease classifier as a fully automated, cloud-native </w:t>
+        <w:t xml:space="preserve"> pipeline built to predict heart disease risk from patient clinical data, covering every stage from raw data ingestion through to live Kubernetes deployment and real-time monitoring. This project builds, deploys and monitors a binary heart disease classifier as a fully automated, cloud-native </w:t>
       </w:r>
       <w:proofErr w:type="spellStart"/>
       <w:r>
@@ -713,12 +727,6 @@
         <w:gridCol w:w="6240"/>
       </w:tblGrid>
       <w:tr>
-        <w:tblPrEx>
-          <w:tblCellMar>
-            <w:top w:w="0" w:type="dxa"/>
-            <w:bottom w:w="0" w:type="dxa"/>
-          </w:tblCellMar>
-        </w:tblPrEx>
         <w:tc>
           <w:tcPr>
             <w:tcW w:w="3120" w:type="dxa"/>
@@ -789,12 +797,6 @@
         </w:tc>
       </w:tr>
       <w:tr>
-        <w:tblPrEx>
-          <w:tblCellMar>
-            <w:top w:w="0" w:type="dxa"/>
-            <w:bottom w:w="0" w:type="dxa"/>
-          </w:tblCellMar>
-        </w:tblPrEx>
         <w:tc>
           <w:tcPr>
             <w:tcW w:w="3120" w:type="dxa"/>
@@ -873,12 +875,6 @@
         </w:tc>
       </w:tr>
       <w:tr>
-        <w:tblPrEx>
-          <w:tblCellMar>
-            <w:top w:w="0" w:type="dxa"/>
-            <w:bottom w:w="0" w:type="dxa"/>
-          </w:tblCellMar>
-        </w:tblPrEx>
         <w:tc>
           <w:tcPr>
             <w:tcW w:w="3120" w:type="dxa"/>
@@ -967,12 +963,6 @@
         </w:tc>
       </w:tr>
       <w:tr>
-        <w:tblPrEx>
-          <w:tblCellMar>
-            <w:top w:w="0" w:type="dxa"/>
-            <w:bottom w:w="0" w:type="dxa"/>
-          </w:tblCellMar>
-        </w:tblPrEx>
         <w:tc>
           <w:tcPr>
             <w:tcW w:w="3120" w:type="dxa"/>
@@ -1079,12 +1069,6 @@
         </w:tc>
       </w:tr>
       <w:tr>
-        <w:tblPrEx>
-          <w:tblCellMar>
-            <w:top w:w="0" w:type="dxa"/>
-            <w:bottom w:w="0" w:type="dxa"/>
-          </w:tblCellMar>
-        </w:tblPrEx>
         <w:tc>
           <w:tcPr>
             <w:tcW w:w="3120" w:type="dxa"/>
@@ -1145,12 +1129,6 @@
         </w:tc>
       </w:tr>
       <w:tr>
-        <w:tblPrEx>
-          <w:tblCellMar>
-            <w:top w:w="0" w:type="dxa"/>
-            <w:bottom w:w="0" w:type="dxa"/>
-          </w:tblCellMar>
-        </w:tblPrEx>
         <w:tc>
           <w:tcPr>
             <w:tcW w:w="3120" w:type="dxa"/>
@@ -1211,12 +1189,6 @@
         </w:tc>
       </w:tr>
       <w:tr>
-        <w:tblPrEx>
-          <w:tblCellMar>
-            <w:top w:w="0" w:type="dxa"/>
-            <w:bottom w:w="0" w:type="dxa"/>
-          </w:tblCellMar>
-        </w:tblPrEx>
         <w:tc>
           <w:tcPr>
             <w:tcW w:w="3120" w:type="dxa"/>
@@ -1277,12 +1249,6 @@
         </w:tc>
       </w:tr>
       <w:tr>
-        <w:tblPrEx>
-          <w:tblCellMar>
-            <w:top w:w="0" w:type="dxa"/>
-            <w:bottom w:w="0" w:type="dxa"/>
-          </w:tblCellMar>
-        </w:tblPrEx>
         <w:tc>
           <w:tcPr>
             <w:tcW w:w="3120" w:type="dxa"/>
@@ -1343,12 +1309,6 @@
         </w:tc>
       </w:tr>
       <w:tr>
-        <w:tblPrEx>
-          <w:tblCellMar>
-            <w:top w:w="0" w:type="dxa"/>
-            <w:bottom w:w="0" w:type="dxa"/>
-          </w:tblCellMar>
-        </w:tblPrEx>
         <w:tc>
           <w:tcPr>
             <w:tcW w:w="3120" w:type="dxa"/>
@@ -1770,6 +1730,9 @@
         <w:spacing w:after="80"/>
       </w:pPr>
       <w:r>
+        <w:rPr>
+          <w:noProof/>
+        </w:rPr>
         <w:lastRenderedPageBreak/>
         <w:drawing>
           <wp:inline distT="0" distB="0" distL="0" distR="0" wp14:anchorId="596EEDBE" wp14:editId="508AE4E7">
@@ -1934,7 +1897,7 @@
           <w:szCs w:val="20"/>
         </w:rPr>
         <w:drawing>
-          <wp:inline distT="0" distB="0" distL="0" distR="0" wp14:anchorId="392892B3" wp14:editId="46A14CAA">
+          <wp:inline distT="0" distB="0" distL="0" distR="0" wp14:anchorId="392892B3" wp14:editId="6242524C">
             <wp:extent cx="6400800" cy="2699385"/>
             <wp:effectExtent l="0" t="0" r="0" b="5715"/>
             <wp:docPr id="1734546508" name="Picture 7"/>
@@ -2090,7 +2053,7 @@
           <w:noProof/>
         </w:rPr>
         <w:drawing>
-          <wp:inline distT="0" distB="0" distL="0" distR="0" wp14:anchorId="43BAB774" wp14:editId="3336DB05">
+          <wp:inline distT="0" distB="0" distL="0" distR="0" wp14:anchorId="43BAB774" wp14:editId="223B914F">
             <wp:extent cx="6400800" cy="1886585"/>
             <wp:effectExtent l="0" t="0" r="0" b="5715"/>
             <wp:docPr id="1445990345" name="Picture 8"/>
@@ -2217,12 +2180,6 @@
         <w:gridCol w:w="3510"/>
       </w:tblGrid>
       <w:tr>
-        <w:tblPrEx>
-          <w:tblCellMar>
-            <w:top w:w="0" w:type="dxa"/>
-            <w:bottom w:w="0" w:type="dxa"/>
-          </w:tblCellMar>
-        </w:tblPrEx>
         <w:tc>
           <w:tcPr>
             <w:tcW w:w="2340" w:type="dxa"/>
@@ -2327,12 +2284,6 @@
         </w:tc>
       </w:tr>
       <w:tr>
-        <w:tblPrEx>
-          <w:tblCellMar>
-            <w:top w:w="0" w:type="dxa"/>
-            <w:bottom w:w="0" w:type="dxa"/>
-          </w:tblCellMar>
-        </w:tblPrEx>
         <w:tc>
           <w:tcPr>
             <w:tcW w:w="2340" w:type="dxa"/>
@@ -2506,12 +2457,6 @@
         </w:tc>
       </w:tr>
       <w:tr>
-        <w:tblPrEx>
-          <w:tblCellMar>
-            <w:top w:w="0" w:type="dxa"/>
-            <w:bottom w:w="0" w:type="dxa"/>
-          </w:tblCellMar>
-        </w:tblPrEx>
         <w:tc>
           <w:tcPr>
             <w:tcW w:w="2340" w:type="dxa"/>
@@ -2958,12 +2903,6 @@
         <w:gridCol w:w="1344"/>
       </w:tblGrid>
       <w:tr>
-        <w:tblPrEx>
-          <w:tblCellMar>
-            <w:top w:w="0" w:type="dxa"/>
-            <w:bottom w:w="0" w:type="dxa"/>
-          </w:tblCellMar>
-        </w:tblPrEx>
         <w:tc>
           <w:tcPr>
             <w:tcW w:w="2400" w:type="dxa"/>
@@ -3170,12 +3109,6 @@
         </w:tc>
       </w:tr>
       <w:tr>
-        <w:tblPrEx>
-          <w:tblCellMar>
-            <w:top w:w="0" w:type="dxa"/>
-            <w:bottom w:w="0" w:type="dxa"/>
-          </w:tblCellMar>
-        </w:tblPrEx>
         <w:tc>
           <w:tcPr>
             <w:tcW w:w="2400" w:type="dxa"/>
@@ -3379,12 +3312,6 @@
         </w:tc>
       </w:tr>
       <w:tr>
-        <w:tblPrEx>
-          <w:tblCellMar>
-            <w:top w:w="0" w:type="dxa"/>
-            <w:bottom w:w="0" w:type="dxa"/>
-          </w:tblCellMar>
-        </w:tblPrEx>
         <w:tc>
           <w:tcPr>
             <w:tcW w:w="2400" w:type="dxa"/>
@@ -3576,12 +3503,6 @@
         </w:tc>
       </w:tr>
       <w:tr>
-        <w:tblPrEx>
-          <w:tblCellMar>
-            <w:top w:w="0" w:type="dxa"/>
-            <w:bottom w:w="0" w:type="dxa"/>
-          </w:tblCellMar>
-        </w:tblPrEx>
         <w:tc>
           <w:tcPr>
             <w:tcW w:w="2400" w:type="dxa"/>
@@ -4717,12 +4638,6 @@
         <w:gridCol w:w="7020"/>
       </w:tblGrid>
       <w:tr>
-        <w:tblPrEx>
-          <w:tblCellMar>
-            <w:top w:w="0" w:type="dxa"/>
-            <w:bottom w:w="0" w:type="dxa"/>
-          </w:tblCellMar>
-        </w:tblPrEx>
         <w:tc>
           <w:tcPr>
             <w:tcW w:w="540" w:type="dxa"/>
@@ -4827,12 +4742,6 @@
         </w:tc>
       </w:tr>
       <w:tr>
-        <w:tblPrEx>
-          <w:tblCellMar>
-            <w:top w:w="0" w:type="dxa"/>
-            <w:bottom w:w="0" w:type="dxa"/>
-          </w:tblCellMar>
-        </w:tblPrEx>
         <w:tc>
           <w:tcPr>
             <w:tcW w:w="540" w:type="dxa"/>
@@ -4943,12 +4852,6 @@
         </w:tc>
       </w:tr>
       <w:tr>
-        <w:tblPrEx>
-          <w:tblCellMar>
-            <w:top w:w="0" w:type="dxa"/>
-            <w:bottom w:w="0" w:type="dxa"/>
-          </w:tblCellMar>
-        </w:tblPrEx>
         <w:tc>
           <w:tcPr>
             <w:tcW w:w="540" w:type="dxa"/>
@@ -5041,12 +4944,6 @@
         </w:tc>
       </w:tr>
       <w:tr>
-        <w:tblPrEx>
-          <w:tblCellMar>
-            <w:top w:w="0" w:type="dxa"/>
-            <w:bottom w:w="0" w:type="dxa"/>
-          </w:tblCellMar>
-        </w:tblPrEx>
         <w:tc>
           <w:tcPr>
             <w:tcW w:w="540" w:type="dxa"/>
@@ -5157,12 +5054,6 @@
         </w:tc>
       </w:tr>
       <w:tr>
-        <w:tblPrEx>
-          <w:tblCellMar>
-            <w:top w:w="0" w:type="dxa"/>
-            <w:bottom w:w="0" w:type="dxa"/>
-          </w:tblCellMar>
-        </w:tblPrEx>
         <w:tc>
           <w:tcPr>
             <w:tcW w:w="540" w:type="dxa"/>
@@ -5255,12 +5146,6 @@
         </w:tc>
       </w:tr>
       <w:tr>
-        <w:tblPrEx>
-          <w:tblCellMar>
-            <w:top w:w="0" w:type="dxa"/>
-            <w:bottom w:w="0" w:type="dxa"/>
-          </w:tblCellMar>
-        </w:tblPrEx>
         <w:tc>
           <w:tcPr>
             <w:tcW w:w="540" w:type="dxa"/>
@@ -5445,12 +5330,6 @@
         <w:gridCol w:w="6472"/>
       </w:tblGrid>
       <w:tr>
-        <w:tblPrEx>
-          <w:tblCellMar>
-            <w:top w:w="0" w:type="dxa"/>
-            <w:bottom w:w="0" w:type="dxa"/>
-          </w:tblCellMar>
-        </w:tblPrEx>
         <w:tc>
           <w:tcPr>
             <w:tcW w:w="1440" w:type="dxa"/>
@@ -5555,12 +5434,6 @@
         </w:tc>
       </w:tr>
       <w:tr>
-        <w:tblPrEx>
-          <w:tblCellMar>
-            <w:top w:w="0" w:type="dxa"/>
-            <w:bottom w:w="0" w:type="dxa"/>
-          </w:tblCellMar>
-        </w:tblPrEx>
         <w:tc>
           <w:tcPr>
             <w:tcW w:w="1440" w:type="dxa"/>
@@ -5668,12 +5541,6 @@
         </w:tc>
       </w:tr>
       <w:tr>
-        <w:tblPrEx>
-          <w:tblCellMar>
-            <w:top w:w="0" w:type="dxa"/>
-            <w:bottom w:w="0" w:type="dxa"/>
-          </w:tblCellMar>
-        </w:tblPrEx>
         <w:tc>
           <w:tcPr>
             <w:tcW w:w="1440" w:type="dxa"/>
@@ -5763,12 +5630,6 @@
         </w:tc>
       </w:tr>
       <w:tr>
-        <w:tblPrEx>
-          <w:tblCellMar>
-            <w:top w:w="0" w:type="dxa"/>
-            <w:bottom w:w="0" w:type="dxa"/>
-          </w:tblCellMar>
-        </w:tblPrEx>
         <w:tc>
           <w:tcPr>
             <w:tcW w:w="1440" w:type="dxa"/>
@@ -5858,12 +5719,6 @@
         </w:tc>
       </w:tr>
       <w:tr>
-        <w:tblPrEx>
-          <w:tblCellMar>
-            <w:top w:w="0" w:type="dxa"/>
-            <w:bottom w:w="0" w:type="dxa"/>
-          </w:tblCellMar>
-        </w:tblPrEx>
         <w:tc>
           <w:tcPr>
             <w:tcW w:w="1440" w:type="dxa"/>
@@ -5953,12 +5808,6 @@
         </w:tc>
       </w:tr>
       <w:tr>
-        <w:tblPrEx>
-          <w:tblCellMar>
-            <w:top w:w="0" w:type="dxa"/>
-            <w:bottom w:w="0" w:type="dxa"/>
-          </w:tblCellMar>
-        </w:tblPrEx>
         <w:tc>
           <w:tcPr>
             <w:tcW w:w="1440" w:type="dxa"/>
@@ -6058,12 +5907,6 @@
         </w:tc>
       </w:tr>
       <w:tr>
-        <w:tblPrEx>
-          <w:tblCellMar>
-            <w:top w:w="0" w:type="dxa"/>
-            <w:bottom w:w="0" w:type="dxa"/>
-          </w:tblCellMar>
-        </w:tblPrEx>
         <w:tc>
           <w:tcPr>
             <w:tcW w:w="1440" w:type="dxa"/>
@@ -6276,12 +6119,6 @@
         <w:gridCol w:w="6240"/>
       </w:tblGrid>
       <w:tr>
-        <w:tblPrEx>
-          <w:tblCellMar>
-            <w:top w:w="0" w:type="dxa"/>
-            <w:bottom w:w="0" w:type="dxa"/>
-          </w:tblCellMar>
-        </w:tblPrEx>
         <w:tc>
           <w:tcPr>
             <w:tcW w:w="3120" w:type="dxa"/>
@@ -6352,12 +6189,6 @@
         </w:tc>
       </w:tr>
       <w:tr>
-        <w:tblPrEx>
-          <w:tblCellMar>
-            <w:top w:w="0" w:type="dxa"/>
-            <w:bottom w:w="0" w:type="dxa"/>
-          </w:tblCellMar>
-        </w:tblPrEx>
         <w:tc>
           <w:tcPr>
             <w:tcW w:w="3120" w:type="dxa"/>
@@ -6446,12 +6277,6 @@
         </w:tc>
       </w:tr>
       <w:tr>
-        <w:tblPrEx>
-          <w:tblCellMar>
-            <w:top w:w="0" w:type="dxa"/>
-            <w:bottom w:w="0" w:type="dxa"/>
-          </w:tblCellMar>
-        </w:tblPrEx>
         <w:tc>
           <w:tcPr>
             <w:tcW w:w="3120" w:type="dxa"/>
@@ -6512,12 +6337,6 @@
         </w:tc>
       </w:tr>
       <w:tr>
-        <w:tblPrEx>
-          <w:tblCellMar>
-            <w:top w:w="0" w:type="dxa"/>
-            <w:bottom w:w="0" w:type="dxa"/>
-          </w:tblCellMar>
-        </w:tblPrEx>
         <w:tc>
           <w:tcPr>
             <w:tcW w:w="3120" w:type="dxa"/>
@@ -6578,12 +6397,6 @@
         </w:tc>
       </w:tr>
       <w:tr>
-        <w:tblPrEx>
-          <w:tblCellMar>
-            <w:top w:w="0" w:type="dxa"/>
-            <w:bottom w:w="0" w:type="dxa"/>
-          </w:tblCellMar>
-        </w:tblPrEx>
         <w:tc>
           <w:tcPr>
             <w:tcW w:w="3120" w:type="dxa"/>
@@ -6644,12 +6457,6 @@
         </w:tc>
       </w:tr>
       <w:tr>
-        <w:tblPrEx>
-          <w:tblCellMar>
-            <w:top w:w="0" w:type="dxa"/>
-            <w:bottom w:w="0" w:type="dxa"/>
-          </w:tblCellMar>
-        </w:tblPrEx>
         <w:tc>
           <w:tcPr>
             <w:tcW w:w="3120" w:type="dxa"/>
@@ -6720,12 +6527,6 @@
         </w:tc>
       </w:tr>
       <w:tr>
-        <w:tblPrEx>
-          <w:tblCellMar>
-            <w:top w:w="0" w:type="dxa"/>
-            <w:bottom w:w="0" w:type="dxa"/>
-          </w:tblCellMar>
-        </w:tblPrEx>
         <w:tc>
           <w:tcPr>
             <w:tcW w:w="3120" w:type="dxa"/>

</xml_diff>

<commit_message>
docs: minor fomatting changes
</commit_message>
<xml_diff>
--- a/Documentation/MLOps_Heart_Disease_Assignment_Report.docx
+++ b/Documentation/MLOps_Heart_Disease_Assignment_Report.docx
@@ -1897,7 +1897,7 @@
           <w:szCs w:val="20"/>
         </w:rPr>
         <w:drawing>
-          <wp:inline distT="0" distB="0" distL="0" distR="0" wp14:anchorId="392892B3" wp14:editId="6242524C">
+          <wp:inline distT="0" distB="0" distL="0" distR="0" wp14:anchorId="392892B3" wp14:editId="0FFEF29C">
             <wp:extent cx="6400800" cy="2699385"/>
             <wp:effectExtent l="0" t="0" r="0" b="5715"/>
             <wp:docPr id="1734546508" name="Picture 7"/>
@@ -1943,8 +1943,6 @@
       <w:pPr>
         <w:spacing w:before="60" w:after="120"/>
         <w:jc w:val="center"/>
-      </w:pPr>
-      <w:r>
         <w:rPr>
           <w:i/>
           <w:iCs/>
@@ -1952,8 +1950,23 @@
           <w:sz w:val="20"/>
           <w:szCs w:val="20"/>
         </w:rPr>
+      </w:pPr>
+      <w:r>
+        <w:rPr>
+          <w:i/>
+          <w:iCs/>
+          <w:color w:val="808080"/>
+          <w:sz w:val="20"/>
+          <w:szCs w:val="20"/>
+        </w:rPr>
         <w:t>Figure 3: Cross-validation score comparison across all three models</w:t>
       </w:r>
+    </w:p>
+    <w:p>
+      <w:pPr>
+        <w:spacing w:before="60" w:after="120"/>
+        <w:jc w:val="center"/>
+      </w:pPr>
     </w:p>
     <w:p>
       <w:pPr>
@@ -1976,6 +1989,7 @@
           <w:sz w:val="20"/>
           <w:szCs w:val="20"/>
         </w:rPr>
+        <w:lastRenderedPageBreak/>
         <w:drawing>
           <wp:inline distT="0" distB="0" distL="0" distR="0" wp14:anchorId="301971A0" wp14:editId="43804426">
             <wp:extent cx="6400800" cy="4951730"/>
@@ -2039,7 +2053,6 @@
           <w:sz w:val="20"/>
           <w:szCs w:val="20"/>
         </w:rPr>
-        <w:lastRenderedPageBreak/>
         <w:t>Figure 4: ROC curves on the held-out test set</w:t>
       </w:r>
     </w:p>
@@ -2047,13 +2060,26 @@
       <w:pPr>
         <w:spacing w:before="60" w:after="120"/>
         <w:jc w:val="center"/>
+        <w:rPr>
+          <w:i/>
+          <w:iCs/>
+          <w:color w:val="808080"/>
+          <w:sz w:val="20"/>
+          <w:szCs w:val="20"/>
+        </w:rPr>
+      </w:pPr>
+    </w:p>
+    <w:p>
+      <w:pPr>
+        <w:spacing w:before="60" w:after="120"/>
+        <w:jc w:val="center"/>
       </w:pPr>
       <w:r>
         <w:rPr>
           <w:noProof/>
         </w:rPr>
         <w:drawing>
-          <wp:inline distT="0" distB="0" distL="0" distR="0" wp14:anchorId="43BAB774" wp14:editId="223B914F">
+          <wp:inline distT="0" distB="0" distL="0" distR="0" wp14:anchorId="43BAB774" wp14:editId="2E51B7A5">
             <wp:extent cx="6400800" cy="1886585"/>
             <wp:effectExtent l="0" t="0" r="0" b="5715"/>
             <wp:docPr id="1445990345" name="Picture 8"/>

</xml_diff>